<commit_message>
Profile: team forecasting in every sales role (correction), 401(k) participant only; update Human Interest (score 86)
Co-Authored-By: Claude Opus 5.5 <noreply@anthropic.com>
Claude-Session: https://claude.ai/code/session_013J244MsEuZNucsaEcbyk8A
</commit_message>
<xml_diff>
--- a/applications/human-interest-manager-retirement-sales-activation/Rotenberg Resume - Human Interest - Manager Retirement Sales Activation.docx
+++ b/applications/human-interest-manager-retirement-sales-activation/Rotenberg Resume - Human Interest - Manager Retirement Sales Activation.docx
@@ -80,7 +80,7 @@
           <w:i w:val="0"/>
           <w:color w:val="1A1A1A"/>
         </w:rPr>
-        <w:t>Onboarding and sales leader with 15+ years in SaaS and agency environments and 2+ years leading teams against monthly quotas. At Wix, led a team of 20 (later 8) onboarding specialists while personally launching 25+ clients a month to their first sale, the point Wix counted an onboarding as won, at 110% of implementation and 120% of sales targets. Led the sales team at Fetch &amp; Funnel next, and ranked top three of 8 to 15 reps at Accelo while quota roughly doubled. Builds the workflows, automation, and process fixes that move volume through a conversion pipeline faster.</w:t>
+        <w:t>Onboarding and sales leader with 15+ years in SaaS and agency environments and 2+ years leading teams against monthly quotas. At Wix, led a team of 20 (later 8) onboarding specialists while personally launching 25+ clients a month to their first sale, the point Wix counted an onboarding as won, at 110% of implementation and 120% of sales targets. Led the sales team at Fetch &amp; Funnel next, and ranked top three of 8 to 15 reps at Accelo while quota roughly doubled. Has run team forecasting in every sales role held, and builds the workflows, automation, and process fixes that move volume through a conversion pipeline faster.</w:t>
       </w:r>
     </w:p>
     <w:p>
@@ -1045,7 +1045,7 @@
           <w:i w:val="0"/>
           <w:color w:val="1A1A1A"/>
         </w:rPr>
-        <w:t>Salesforce, HubSpot, Pipeline Stage Tracking &amp; Forecast Hygiene, Excel, Power BI, Dashboards &amp; KPI Reporting, Workflow Automation</w:t>
+        <w:t>Salesforce, HubSpot, Team &amp; Pipeline Forecasting, Excel, Power BI, Dashboards &amp; KPI Reporting, Workflow Automation</w:t>
       </w:r>
     </w:p>
     <w:p>

</xml_diff>